<commit_message>
Pack 54.0-fix3: v2 Sber — убрал зелёный + vAlign R0C3 + подпись 25мм + grayscale logo
</commit_message>
<xml_diff>
--- a/templates/docx/bank_statement_template_044525225_v2.docx
+++ b/templates/docx/bank_statement_template_044525225_v2.docx
@@ -2,6 +2,7 @@
 <file path=word/document.xml><?xml version="1.0" encoding="utf-8"?>
 <w:document xmlns:wpc="http://schemas.microsoft.com/office/word/2010/wordprocessingCanvas" xmlns:mo="http://schemas.microsoft.com/office/mac/office/2008/main" xmlns:mc="http://schemas.openxmlformats.org/markup-compatibility/2006" xmlns:mv="urn:schemas-microsoft-com:mac:vml" xmlns:o="urn:schemas-microsoft-com:office:office" xmlns:r="http://schemas.openxmlformats.org/officeDocument/2006/relationships" xmlns:m="http://schemas.openxmlformats.org/officeDocument/2006/math" xmlns:v="urn:schemas-microsoft-com:vml" xmlns:wp14="http://schemas.microsoft.com/office/word/2010/wordprocessingDrawing" xmlns:wp="http://schemas.openxmlformats.org/drawingml/2006/wordprocessingDrawing" xmlns:w10="urn:schemas-microsoft-com:office:word" xmlns:w="http://schemas.openxmlformats.org/wordprocessingml/2006/main" xmlns:w14="http://schemas.microsoft.com/office/word/2010/wordml" xmlns:wpg="http://schemas.microsoft.com/office/word/2010/wordprocessingGroup" xmlns:wpi="http://schemas.microsoft.com/office/word/2010/wordprocessingInk" xmlns:wne="http://schemas.microsoft.com/office/word/2006/wordml" xmlns:wps="http://schemas.microsoft.com/office/word/2010/wordprocessingShape" mc:Ignorable="w14 wp14">
   <w:body>
+    <!-- Pack 54.0-fix3 -->
     <w:tbl>
       <w:tblGrid>
         <w:gridCol w:w="2267"/>
@@ -577,7 +578,7 @@
                     <w:rPr>
                       <w:rFonts w:ascii="Arial" w:hAnsi="Arial" w:cs="Arial"/>
                       <w:b/>
-                      <w:color w:val="21A038"/>
+                      <w:color w:val="1A1A1A"/>
                       <w:sz w:val="16"/>
                     </w:rPr>
                     <w:t>ИТОГО ПО ОПЕРАЦИЯМ ЗА ПЕРИОД:</w:t>
@@ -587,7 +588,7 @@
                   <w:pPr>
                     <w:spacing w:before="0" w:after="0"/>
                     <w:pBdr>
-                      <w:bottom w:val="single" w:sz="12" w:space="1" w:color="21A038"/>
+                      <w:bottom w:val="single" w:sz="12" w:space="1" w:color="1A1A1A"/>
                     </w:pBdr>
                   </w:pPr>
                 </w:p>
@@ -1372,6 +1373,7 @@
             <w:tcBorders>
               <w:bottom w:val="single" w:sz="8" w:space="0" w:color="auto"/>
             </w:tcBorders>
+            <w:vAlign w:val="bottom"/>
           </w:tcPr>
           <w:p>
             <w:pPr>

</xml_diff>

<commit_message>
fix(template): sber v2 footer page numbering (Pack 73.7)
</commit_message>
<xml_diff>
--- a/templates/docx/bank_statement_template_044525225_v2.docx
+++ b/templates/docx/bank_statement_template_044525225_v2.docx
@@ -1803,6 +1803,7 @@
   <w:p>
     <w:pPr>
       <w:pStyle w:val="Footer"/>
+      <w:jc w:val="right"/>
     </w:pPr>
     <w:r>
       <w:rPr>
@@ -1810,6 +1811,22 @@
         <w:color w:val="808080"/>
         <w:sz w:val="16"/>
       </w:rPr>
+      <w:t>Страница</w:t>
+    </w:r>
+    <w:r>
+      <w:rPr>
+        <w:rFonts w:ascii="Arial" w:hAnsi="Arial" w:cs="Arial"/>
+        <w:color w:val="808080"/>
+        <w:sz w:val="16"/>
+      </w:rPr>
+      <w:t xml:space="preserve"> </w:t>
+    </w:r>
+    <w:r>
+      <w:rPr>
+        <w:rFonts w:ascii="Arial" w:hAnsi="Arial" w:cs="Arial"/>
+        <w:color w:val="808080"/>
+        <w:sz w:val="16"/>
+      </w:rPr>
       <w:fldChar w:fldCharType="begin"/>
     </w:r>
     <w:r>
@@ -1818,7 +1835,7 @@
         <w:color w:val="808080"/>
         <w:sz w:val="16"/>
       </w:rPr>
-      <w:instrText xml:space="preserve"> IF </w:instrText>
+      <w:instrText xml:space="preserve"> PAGE </w:instrText>
     </w:r>
     <w:r>
       <w:rPr>
@@ -1826,6 +1843,54 @@
         <w:color w:val="808080"/>
         <w:sz w:val="16"/>
       </w:rPr>
+      <w:fldChar w:fldCharType="separate"/>
+    </w:r>
+    <w:r>
+      <w:rPr>
+        <w:rFonts w:ascii="Arial" w:hAnsi="Arial" w:cs="Arial"/>
+        <w:color w:val="808080"/>
+        <w:sz w:val="16"/>
+      </w:rPr>
+      <w:t>1</w:t>
+    </w:r>
+    <w:r>
+      <w:rPr>
+        <w:rFonts w:ascii="Arial" w:hAnsi="Arial" w:cs="Arial"/>
+        <w:color w:val="808080"/>
+        <w:sz w:val="16"/>
+      </w:rPr>
+      <w:fldChar w:fldCharType="end"/>
+    </w:r>
+    <w:r>
+      <w:rPr>
+        <w:rFonts w:ascii="Arial" w:hAnsi="Arial" w:cs="Arial"/>
+        <w:color w:val="808080"/>
+        <w:sz w:val="16"/>
+      </w:rPr>
+      <w:t xml:space="preserve"> </w:t>
+    </w:r>
+    <w:r>
+      <w:rPr>
+        <w:rFonts w:ascii="Arial" w:hAnsi="Arial" w:cs="Arial"/>
+        <w:color w:val="808080"/>
+        <w:sz w:val="16"/>
+      </w:rPr>
+      <w:t>из</w:t>
+    </w:r>
+    <w:r>
+      <w:rPr>
+        <w:rFonts w:ascii="Arial" w:hAnsi="Arial" w:cs="Arial"/>
+        <w:color w:val="808080"/>
+        <w:sz w:val="16"/>
+      </w:rPr>
+      <w:t xml:space="preserve"> </w:t>
+    </w:r>
+    <w:r>
+      <w:rPr>
+        <w:rFonts w:ascii="Arial" w:hAnsi="Arial" w:cs="Arial"/>
+        <w:color w:val="808080"/>
+        <w:sz w:val="16"/>
+      </w:rPr>
       <w:fldChar w:fldCharType="begin"/>
     </w:r>
     <w:r>
@@ -1834,7 +1899,7 @@
         <w:color w:val="808080"/>
         <w:sz w:val="16"/>
       </w:rPr>
-      <w:instrText xml:space="preserve"> PAGE </w:instrText>
+      <w:instrText xml:space="preserve"> NUMPAGES </w:instrText>
     </w:r>
     <w:r>
       <w:rPr>
@@ -1850,87 +1915,7 @@
         <w:color w:val="808080"/>
         <w:sz w:val="16"/>
       </w:rPr>
-      <w:t xml:space="preserve"/>
-    </w:r>
-    <w:r>
-      <w:rPr>
-        <w:rFonts w:ascii="Arial" w:hAnsi="Arial" w:cs="Arial"/>
-        <w:color w:val="808080"/>
-        <w:sz w:val="16"/>
-      </w:rPr>
-      <w:fldChar w:fldCharType="end"/>
-    </w:r>
-    <w:r>
-      <w:rPr>
-        <w:rFonts w:ascii="Arial" w:hAnsi="Arial" w:cs="Arial"/>
-        <w:color w:val="808080"/>
-        <w:sz w:val="16"/>
-      </w:rPr>
-      <w:instrText xml:space="preserve"> = </w:instrText>
-    </w:r>
-    <w:r>
-      <w:rPr>
-        <w:rFonts w:ascii="Arial" w:hAnsi="Arial" w:cs="Arial"/>
-        <w:color w:val="808080"/>
-        <w:sz w:val="16"/>
-      </w:rPr>
-      <w:fldChar w:fldCharType="begin"/>
-    </w:r>
-    <w:r>
-      <w:rPr>
-        <w:rFonts w:ascii="Arial" w:hAnsi="Arial" w:cs="Arial"/>
-        <w:color w:val="808080"/>
-        <w:sz w:val="16"/>
-      </w:rPr>
-      <w:instrText xml:space="preserve"> NUMPAGES </w:instrText>
-    </w:r>
-    <w:r>
-      <w:rPr>
-        <w:rFonts w:ascii="Arial" w:hAnsi="Arial" w:cs="Arial"/>
-        <w:color w:val="808080"/>
-        <w:sz w:val="16"/>
-      </w:rPr>
-      <w:fldChar w:fldCharType="separate"/>
-    </w:r>
-    <w:r>
-      <w:rPr>
-        <w:rFonts w:ascii="Arial" w:hAnsi="Arial" w:cs="Arial"/>
-        <w:color w:val="808080"/>
-        <w:sz w:val="16"/>
-      </w:rPr>
-      <w:t xml:space="preserve"/>
-    </w:r>
-    <w:r>
-      <w:rPr>
-        <w:rFonts w:ascii="Arial" w:hAnsi="Arial" w:cs="Arial"/>
-        <w:color w:val="808080"/>
-        <w:sz w:val="16"/>
-      </w:rPr>
-      <w:fldChar w:fldCharType="end"/>
-    </w:r>
-    <w:r>
-      <w:rPr>
-        <w:rFonts w:ascii="Arial" w:hAnsi="Arial" w:cs="Arial"/>
-        <w:color w:val="808080"/>
-        <w:sz w:val="16"/>
-      </w:rPr>
-      <w:instrText xml:space="preserve"> "" "Продолжение на следующей странице"</w:instrText>
-    </w:r>
-    <w:r>
-      <w:rPr>
-        <w:rFonts w:ascii="Arial" w:hAnsi="Arial" w:cs="Arial"/>
-        <w:color w:val="808080"/>
-        <w:sz w:val="16"/>
-      </w:rPr>
-      <w:fldChar w:fldCharType="separate"/>
-    </w:r>
-    <w:r>
-      <w:rPr>
-        <w:rFonts w:ascii="Arial" w:hAnsi="Arial" w:cs="Arial"/>
-        <w:color w:val="808080"/>
-        <w:sz w:val="16"/>
-      </w:rPr>
-      <w:t xml:space="preserve"/>
+      <w:t>1</w:t>
     </w:r>
     <w:r>
       <w:rPr>

</xml_diff>

<commit_message>
refactor(templates): restore v2 originals, move Pack 73.x to v2-shengen (Pack 73.9)
</commit_message>
<xml_diff>
--- a/templates/docx/bank_statement_template_044525225_v2.docx
+++ b/templates/docx/bank_statement_template_044525225_v2.docx
@@ -1803,7 +1803,6 @@
   <w:p>
     <w:pPr>
       <w:pStyle w:val="Footer"/>
-      <w:jc w:val="right"/>
     </w:pPr>
     <w:r>
       <w:rPr>
@@ -1811,7 +1810,7 @@
         <w:color w:val="808080"/>
         <w:sz w:val="16"/>
       </w:rPr>
-      <w:t>Страница</w:t>
+      <w:fldChar w:fldCharType="begin"/>
     </w:r>
     <w:r>
       <w:rPr>
@@ -1819,7 +1818,7 @@
         <w:color w:val="808080"/>
         <w:sz w:val="16"/>
       </w:rPr>
-      <w:t xml:space="preserve"> </w:t>
+      <w:instrText xml:space="preserve"> IF </w:instrText>
     </w:r>
     <w:r>
       <w:rPr>
@@ -1851,7 +1850,7 @@
         <w:color w:val="808080"/>
         <w:sz w:val="16"/>
       </w:rPr>
-      <w:t>1</w:t>
+      <w:t xml:space="preserve"/>
     </w:r>
     <w:r>
       <w:rPr>
@@ -1867,7 +1866,7 @@
         <w:color w:val="808080"/>
         <w:sz w:val="16"/>
       </w:rPr>
-      <w:t xml:space="preserve"> </w:t>
+      <w:instrText xml:space="preserve"> = </w:instrText>
     </w:r>
     <w:r>
       <w:rPr>
@@ -1875,7 +1874,7 @@
         <w:color w:val="808080"/>
         <w:sz w:val="16"/>
       </w:rPr>
-      <w:t>из</w:t>
+      <w:fldChar w:fldCharType="begin"/>
     </w:r>
     <w:r>
       <w:rPr>
@@ -1883,7 +1882,7 @@
         <w:color w:val="808080"/>
         <w:sz w:val="16"/>
       </w:rPr>
-      <w:t xml:space="preserve"> </w:t>
+      <w:instrText xml:space="preserve"> NUMPAGES </w:instrText>
     </w:r>
     <w:r>
       <w:rPr>
@@ -1891,7 +1890,7 @@
         <w:color w:val="808080"/>
         <w:sz w:val="16"/>
       </w:rPr>
-      <w:fldChar w:fldCharType="begin"/>
+      <w:fldChar w:fldCharType="separate"/>
     </w:r>
     <w:r>
       <w:rPr>
@@ -1899,7 +1898,7 @@
         <w:color w:val="808080"/>
         <w:sz w:val="16"/>
       </w:rPr>
-      <w:instrText xml:space="preserve"> NUMPAGES </w:instrText>
+      <w:t xml:space="preserve"/>
     </w:r>
     <w:r>
       <w:rPr>
@@ -1907,6 +1906,22 @@
         <w:color w:val="808080"/>
         <w:sz w:val="16"/>
       </w:rPr>
+      <w:fldChar w:fldCharType="end"/>
+    </w:r>
+    <w:r>
+      <w:rPr>
+        <w:rFonts w:ascii="Arial" w:hAnsi="Arial" w:cs="Arial"/>
+        <w:color w:val="808080"/>
+        <w:sz w:val="16"/>
+      </w:rPr>
+      <w:instrText xml:space="preserve"> "" "Продолжение на следующей странице"</w:instrText>
+    </w:r>
+    <w:r>
+      <w:rPr>
+        <w:rFonts w:ascii="Arial" w:hAnsi="Arial" w:cs="Arial"/>
+        <w:color w:val="808080"/>
+        <w:sz w:val="16"/>
+      </w:rPr>
       <w:fldChar w:fldCharType="separate"/>
     </w:r>
     <w:r>
@@ -1915,7 +1930,7 @@
         <w:color w:val="808080"/>
         <w:sz w:val="16"/>
       </w:rPr>
-      <w:t>1</w:t>
+      <w:t xml:space="preserve"/>
     </w:r>
     <w:r>
       <w:rPr>

</xml_diff>

<commit_message>
fix(templates): apply 3 base-template fixes (Pack 73.4/73.7/73.8 on originals)
</commit_message>
<xml_diff>
--- a/templates/docx/bank_statement_template_044525225_v2.docx
+++ b/templates/docx/bank_statement_template_044525225_v2.docx
@@ -1803,6 +1803,7 @@
   <w:p>
     <w:pPr>
       <w:pStyle w:val="Footer"/>
+      <w:jc w:val="right"/>
     </w:pPr>
     <w:r>
       <w:rPr>
@@ -1810,6 +1811,22 @@
         <w:color w:val="808080"/>
         <w:sz w:val="16"/>
       </w:rPr>
+      <w:t>Страница</w:t>
+    </w:r>
+    <w:r>
+      <w:rPr>
+        <w:rFonts w:ascii="Arial" w:hAnsi="Arial" w:cs="Arial"/>
+        <w:color w:val="808080"/>
+        <w:sz w:val="16"/>
+      </w:rPr>
+      <w:t xml:space="preserve"> </w:t>
+    </w:r>
+    <w:r>
+      <w:rPr>
+        <w:rFonts w:ascii="Arial" w:hAnsi="Arial" w:cs="Arial"/>
+        <w:color w:val="808080"/>
+        <w:sz w:val="16"/>
+      </w:rPr>
       <w:fldChar w:fldCharType="begin"/>
     </w:r>
     <w:r>
@@ -1818,7 +1835,7 @@
         <w:color w:val="808080"/>
         <w:sz w:val="16"/>
       </w:rPr>
-      <w:instrText xml:space="preserve"> IF </w:instrText>
+      <w:instrText xml:space="preserve"> PAGE </w:instrText>
     </w:r>
     <w:r>
       <w:rPr>
@@ -1826,6 +1843,54 @@
         <w:color w:val="808080"/>
         <w:sz w:val="16"/>
       </w:rPr>
+      <w:fldChar w:fldCharType="separate"/>
+    </w:r>
+    <w:r>
+      <w:rPr>
+        <w:rFonts w:ascii="Arial" w:hAnsi="Arial" w:cs="Arial"/>
+        <w:color w:val="808080"/>
+        <w:sz w:val="16"/>
+      </w:rPr>
+      <w:t>1</w:t>
+    </w:r>
+    <w:r>
+      <w:rPr>
+        <w:rFonts w:ascii="Arial" w:hAnsi="Arial" w:cs="Arial"/>
+        <w:color w:val="808080"/>
+        <w:sz w:val="16"/>
+      </w:rPr>
+      <w:fldChar w:fldCharType="end"/>
+    </w:r>
+    <w:r>
+      <w:rPr>
+        <w:rFonts w:ascii="Arial" w:hAnsi="Arial" w:cs="Arial"/>
+        <w:color w:val="808080"/>
+        <w:sz w:val="16"/>
+      </w:rPr>
+      <w:t xml:space="preserve"> </w:t>
+    </w:r>
+    <w:r>
+      <w:rPr>
+        <w:rFonts w:ascii="Arial" w:hAnsi="Arial" w:cs="Arial"/>
+        <w:color w:val="808080"/>
+        <w:sz w:val="16"/>
+      </w:rPr>
+      <w:t>из</w:t>
+    </w:r>
+    <w:r>
+      <w:rPr>
+        <w:rFonts w:ascii="Arial" w:hAnsi="Arial" w:cs="Arial"/>
+        <w:color w:val="808080"/>
+        <w:sz w:val="16"/>
+      </w:rPr>
+      <w:t xml:space="preserve"> </w:t>
+    </w:r>
+    <w:r>
+      <w:rPr>
+        <w:rFonts w:ascii="Arial" w:hAnsi="Arial" w:cs="Arial"/>
+        <w:color w:val="808080"/>
+        <w:sz w:val="16"/>
+      </w:rPr>
       <w:fldChar w:fldCharType="begin"/>
     </w:r>
     <w:r>
@@ -1834,7 +1899,7 @@
         <w:color w:val="808080"/>
         <w:sz w:val="16"/>
       </w:rPr>
-      <w:instrText xml:space="preserve"> PAGE </w:instrText>
+      <w:instrText xml:space="preserve"> NUMPAGES </w:instrText>
     </w:r>
     <w:r>
       <w:rPr>
@@ -1850,87 +1915,7 @@
         <w:color w:val="808080"/>
         <w:sz w:val="16"/>
       </w:rPr>
-      <w:t xml:space="preserve"/>
-    </w:r>
-    <w:r>
-      <w:rPr>
-        <w:rFonts w:ascii="Arial" w:hAnsi="Arial" w:cs="Arial"/>
-        <w:color w:val="808080"/>
-        <w:sz w:val="16"/>
-      </w:rPr>
-      <w:fldChar w:fldCharType="end"/>
-    </w:r>
-    <w:r>
-      <w:rPr>
-        <w:rFonts w:ascii="Arial" w:hAnsi="Arial" w:cs="Arial"/>
-        <w:color w:val="808080"/>
-        <w:sz w:val="16"/>
-      </w:rPr>
-      <w:instrText xml:space="preserve"> = </w:instrText>
-    </w:r>
-    <w:r>
-      <w:rPr>
-        <w:rFonts w:ascii="Arial" w:hAnsi="Arial" w:cs="Arial"/>
-        <w:color w:val="808080"/>
-        <w:sz w:val="16"/>
-      </w:rPr>
-      <w:fldChar w:fldCharType="begin"/>
-    </w:r>
-    <w:r>
-      <w:rPr>
-        <w:rFonts w:ascii="Arial" w:hAnsi="Arial" w:cs="Arial"/>
-        <w:color w:val="808080"/>
-        <w:sz w:val="16"/>
-      </w:rPr>
-      <w:instrText xml:space="preserve"> NUMPAGES </w:instrText>
-    </w:r>
-    <w:r>
-      <w:rPr>
-        <w:rFonts w:ascii="Arial" w:hAnsi="Arial" w:cs="Arial"/>
-        <w:color w:val="808080"/>
-        <w:sz w:val="16"/>
-      </w:rPr>
-      <w:fldChar w:fldCharType="separate"/>
-    </w:r>
-    <w:r>
-      <w:rPr>
-        <w:rFonts w:ascii="Arial" w:hAnsi="Arial" w:cs="Arial"/>
-        <w:color w:val="808080"/>
-        <w:sz w:val="16"/>
-      </w:rPr>
-      <w:t xml:space="preserve"/>
-    </w:r>
-    <w:r>
-      <w:rPr>
-        <w:rFonts w:ascii="Arial" w:hAnsi="Arial" w:cs="Arial"/>
-        <w:color w:val="808080"/>
-        <w:sz w:val="16"/>
-      </w:rPr>
-      <w:fldChar w:fldCharType="end"/>
-    </w:r>
-    <w:r>
-      <w:rPr>
-        <w:rFonts w:ascii="Arial" w:hAnsi="Arial" w:cs="Arial"/>
-        <w:color w:val="808080"/>
-        <w:sz w:val="16"/>
-      </w:rPr>
-      <w:instrText xml:space="preserve"> "" "Продолжение на следующей странице"</w:instrText>
-    </w:r>
-    <w:r>
-      <w:rPr>
-        <w:rFonts w:ascii="Arial" w:hAnsi="Arial" w:cs="Arial"/>
-        <w:color w:val="808080"/>
-        <w:sz w:val="16"/>
-      </w:rPr>
-      <w:fldChar w:fldCharType="separate"/>
-    </w:r>
-    <w:r>
-      <w:rPr>
-        <w:rFonts w:ascii="Arial" w:hAnsi="Arial" w:cs="Arial"/>
-        <w:color w:val="808080"/>
-        <w:sz w:val="16"/>
-      </w:rPr>
-      <w:t xml:space="preserve"/>
+      <w:t>1</w:t>
     </w:r>
     <w:r>
       <w:rPr>

</xml_diff>